<commit_message>
Remove Korea-specific references for international venue
- references.bib: drop KoreaMOE2022 (2022 Revised National Curriculum)
- paper_ko.md §1.1: rewrite motivation paragraph without Korean
  curriculum framing; cite Caplin 2009 / Hepokoski & Darcy 2006 instead
- paper_ko.md References: drop 교육부 2022 and 이흥렬·홍정수 2017
- Regenerate paper_ko.docx

Rationale: target venues (TISMIR primary, Information Visualization
secondary) are international and have no Korean readership; localized
references add no value and weaken positioning.

Co-Authored-By: Claude Opus 4.7 (1M context) <noreply@anthropic.com>
</commit_message>
<xml_diff>
--- a/en/paper/paper_ko.docx
+++ b/en/paper/paper_ko.docx
@@ -1544,19 +1544,43 @@
         <w:t xml:space="preserve"> </w:t>
       </w:r>
       <w:r>
-        <w:t>오늘날까지</w:t>
-      </w:r>
-      <w:r>
-        <w:t xml:space="preserve"> </w:t>
-      </w:r>
-      <w:r>
-        <w:t>음악교육의</w:t>
-      </w:r>
-      <w:r>
-        <w:t xml:space="preserve"> </w:t>
-      </w:r>
-      <w:r>
-        <w:t>중핵</w:t>
+        <w:t>중등</w:t>
+      </w:r>
+      <w:r>
+        <w:t>·</w:t>
+      </w:r>
+      <w:r>
+        <w:t>고등</w:t>
+      </w:r>
+      <w:r>
+        <w:t xml:space="preserve"> </w:t>
+      </w:r>
+      <w:r>
+        <w:t>음악이론</w:t>
+      </w:r>
+      <w:r>
+        <w:t xml:space="preserve"> </w:t>
+      </w:r>
+      <w:r>
+        <w:t>및</w:t>
+      </w:r>
+      <w:r>
+        <w:t xml:space="preserve"> </w:t>
+      </w:r>
+      <w:r>
+        <w:t>서양음악사</w:t>
+      </w:r>
+      <w:r>
+        <w:t xml:space="preserve"> </w:t>
+      </w:r>
+      <w:r>
+        <w:t>교과에서</w:t>
+      </w:r>
+      <w:r>
+        <w:t xml:space="preserve"> </w:t>
+      </w:r>
+      <w:r>
+        <w:t>핵심</w:t>
       </w:r>
       <w:r>
         <w:t xml:space="preserve"> </w:t>
@@ -1589,221 +1613,7 @@
         <w:t>있다</w:t>
       </w:r>
       <w:r>
-        <w:t xml:space="preserve">. </w:t>
-      </w:r>
-      <w:r>
-        <w:t>한국</w:t>
-      </w:r>
-      <w:r>
-        <w:t xml:space="preserve"> 2022 </w:t>
-      </w:r>
-      <w:r>
-        <w:t>개정</w:t>
-      </w:r>
-      <w:r>
-        <w:t xml:space="preserve"> </w:t>
-      </w:r>
-      <w:r>
-        <w:t>교육과정</w:t>
-      </w:r>
-      <w:r>
-        <w:t xml:space="preserve"> </w:t>
-      </w:r>
-      <w:r>
-        <w:t>음악과의</w:t>
-      </w:r>
-      <w:r>
-        <w:t xml:space="preserve"> </w:t>
-      </w:r>
-      <w:r>
-        <w:t>일반선택</w:t>
-      </w:r>
-      <w:r>
-        <w:t xml:space="preserve"> </w:t>
-      </w:r>
-      <w:r>
-        <w:t>과목</w:t>
-      </w:r>
-      <w:r>
-        <w:t xml:space="preserve"> “</w:t>
-      </w:r>
-      <w:r>
-        <w:t>음악</w:t>
-      </w:r>
-      <w:r>
-        <w:t xml:space="preserve"> </w:t>
-      </w:r>
-      <w:r>
-        <w:t>감상과</w:t>
-      </w:r>
-      <w:r>
-        <w:t xml:space="preserve"> </w:t>
-      </w:r>
-      <w:r>
-        <w:t>비평</w:t>
-      </w:r>
-      <w:r>
-        <w:t xml:space="preserve">” </w:t>
-      </w:r>
-      <w:r>
-        <w:t>은</w:t>
-      </w:r>
-      <w:r>
-        <w:t xml:space="preserve"> </w:t>
-      </w:r>
-      <w:r>
-        <w:rPr>
-          <w:i/>
-          <w:iCs/>
-        </w:rPr>
-        <w:t>형식의</w:t>
-      </w:r>
-      <w:r>
-        <w:rPr>
-          <w:i/>
-          <w:iCs/>
-        </w:rPr>
-        <w:t xml:space="preserve"> </w:t>
-      </w:r>
-      <w:r>
-        <w:rPr>
-          <w:i/>
-          <w:iCs/>
-        </w:rPr>
-        <w:t>인지와</w:t>
-      </w:r>
-      <w:r>
-        <w:rPr>
-          <w:i/>
-          <w:iCs/>
-        </w:rPr>
-        <w:t xml:space="preserve"> </w:t>
-      </w:r>
-      <w:r>
-        <w:rPr>
-          <w:i/>
-          <w:iCs/>
-        </w:rPr>
-        <w:t>비평적</w:t>
-      </w:r>
-      <w:r>
-        <w:rPr>
-          <w:i/>
-          <w:iCs/>
-        </w:rPr>
-        <w:t xml:space="preserve"> </w:t>
-      </w:r>
-      <w:r>
-        <w:rPr>
-          <w:i/>
-          <w:iCs/>
-        </w:rPr>
-        <w:t>기술</w:t>
-      </w:r>
-      <w:r>
-        <w:t xml:space="preserve"> </w:t>
-      </w:r>
-      <w:r>
-        <w:t>을</w:t>
-      </w:r>
-      <w:r>
-        <w:t xml:space="preserve"> </w:t>
-      </w:r>
-      <w:r>
-        <w:t>핵심</w:t>
-      </w:r>
-      <w:r>
-        <w:t xml:space="preserve"> </w:t>
-      </w:r>
-      <w:r>
-        <w:t>성취기준으로</w:t>
-      </w:r>
-      <w:r>
-        <w:t xml:space="preserve"> </w:t>
-      </w:r>
-      <w:r>
-        <w:t>명시하며</w:t>
-      </w:r>
-      <w:r>
-        <w:t>(</w:t>
-      </w:r>
-      <w:r>
-        <w:t>교육부</w:t>
-      </w:r>
-      <w:r>
-        <w:t xml:space="preserve">, 2022), </w:t>
-      </w:r>
-      <w:r>
-        <w:t>대학</w:t>
-      </w:r>
-      <w:r>
-        <w:t xml:space="preserve"> </w:t>
-      </w:r>
-      <w:r>
-        <w:t>음악이론</w:t>
-      </w:r>
-      <w:r>
-        <w:t>·</w:t>
-      </w:r>
-      <w:r>
-        <w:t>서양음악사</w:t>
-      </w:r>
-      <w:r>
-        <w:t xml:space="preserve"> </w:t>
-      </w:r>
-      <w:r>
-        <w:t>교과서</w:t>
-      </w:r>
-      <w:r>
-        <w:t xml:space="preserve"> </w:t>
-      </w:r>
-      <w:r>
-        <w:t>역시</w:t>
-      </w:r>
-      <w:r>
-        <w:t xml:space="preserve"> </w:t>
-      </w:r>
-      <w:r>
-        <w:t>소나타</w:t>
-      </w:r>
-      <w:r>
-        <w:t xml:space="preserve"> </w:t>
-      </w:r>
-      <w:r>
-        <w:t>형식을</w:t>
-      </w:r>
-      <w:r>
-        <w:t xml:space="preserve"> </w:t>
-      </w:r>
-      <w:r>
-        <w:t>단원의</w:t>
-      </w:r>
-      <w:r>
-        <w:t xml:space="preserve"> </w:t>
-      </w:r>
-      <w:r>
-        <w:t>기둥으로</w:t>
-      </w:r>
-      <w:r>
-        <w:t xml:space="preserve"> </w:t>
-      </w:r>
-      <w:r>
-        <w:t>삼는다</w:t>
-      </w:r>
-      <w:r>
-        <w:t>(</w:t>
-      </w:r>
-      <w:r>
-        <w:t>이흥렬</w:t>
-      </w:r>
-      <w:r>
-        <w:t>·</w:t>
-      </w:r>
-      <w:r>
-        <w:t>홍정수</w:t>
-      </w:r>
-      <w:r>
-        <w:t>, 2017).</w:t>
+        <w:t>(Caplin, 2009; Hepokoski &amp; Darcy, 2006).</w:t>
       </w:r>
     </w:p>
     <w:p>
@@ -3853,7 +3663,6 @@
           <w:b/>
           <w:bCs/>
         </w:rPr>
-        <w:lastRenderedPageBreak/>
         <w:t>하위</w:t>
       </w:r>
       <w:r>
@@ -3936,6 +3745,7 @@
         <w:pStyle w:val="a0"/>
       </w:pPr>
       <w:r>
+        <w:lastRenderedPageBreak/>
         <w:t>이</w:t>
       </w:r>
       <w:r>
@@ -6820,7 +6630,10 @@
         <w:t>.</w:t>
       </w:r>
       <w:r>
-        <w:t xml:space="preserve"> Allegraud et al. (2019) </w:t>
+        <w:t xml:space="preserve"> </w:t>
+      </w:r>
+      <w:r>
+        <w:t xml:space="preserve">Allegraud et al. (2019) </w:t>
       </w:r>
       <w:r>
         <w:t>은</w:t>
@@ -7248,7 +7061,6 @@
                 <w:b/>
                 <w:sz w:val="20"/>
               </w:rPr>
-              <w:lastRenderedPageBreak/>
               <w:t>도구</w:t>
             </w:r>
           </w:p>
@@ -7538,7 +7350,14 @@
               <w:rPr>
                 <w:sz w:val="20"/>
               </w:rPr>
-              <w:t>Sonic Visualiser (Cannam et al. 2010)</w:t>
+              <w:t xml:space="preserve">Sonic Visualiser (Cannam et </w:t>
+            </w:r>
+            <w:r>
+              <w:rPr>
+                <w:sz w:val="20"/>
+              </w:rPr>
+              <w:lastRenderedPageBreak/>
+              <w:t>al. 2010)</w:t>
             </w:r>
           </w:p>
         </w:tc>
@@ -7560,6 +7379,7 @@
               <w:rPr>
                 <w:sz w:val="20"/>
               </w:rPr>
+              <w:lastRenderedPageBreak/>
               <w:t>△ (</w:t>
             </w:r>
             <w:r>
@@ -8718,10 +8538,7 @@
         <w:t>주장은</w:t>
       </w:r>
       <w:r>
-        <w:t xml:space="preserve"> </w:t>
-      </w:r>
-      <w:r>
-        <w:t>“</w:t>
+        <w:t xml:space="preserve"> “</w:t>
       </w:r>
       <w:r>
         <w:t>최초의</w:t>
@@ -10737,7 +10554,6 @@
       <w:bookmarkStart w:id="14" w:name="교육적-핵심-하속조-재현의-의의"/>
       <w:bookmarkEnd w:id="13"/>
       <w:r>
-        <w:lastRenderedPageBreak/>
         <w:t xml:space="preserve">3.3 </w:t>
       </w:r>
       <w:r>
@@ -10887,10 +10703,7 @@
         <w:t>분류된다</w:t>
       </w:r>
       <w:r>
-        <w:t xml:space="preserve">(Hepokoski &amp; Darcy, 2006: </w:t>
-      </w:r>
-      <w:r>
-        <w:t xml:space="preserve">ch. 17). </w:t>
+        <w:t xml:space="preserve">(Hepokoski &amp; Darcy, 2006: ch. 17). </w:t>
       </w:r>
       <w:r>
         <w:t>이는</w:t>
@@ -10950,6 +10763,7 @@
         <w:pStyle w:val="a8"/>
       </w:pPr>
       <w:r>
+        <w:lastRenderedPageBreak/>
         <w:t>만약</w:t>
       </w:r>
       <w:r>
@@ -13980,7 +13794,6 @@
               <w:rPr>
                 <w:sz w:val="20"/>
               </w:rPr>
-              <w:lastRenderedPageBreak/>
               <w:t>재현부</w:t>
             </w:r>
           </w:p>
@@ -14154,6 +13967,7 @@
       <w:bookmarkStart w:id="18" w:name="데이터로서의-분석-계층"/>
       <w:bookmarkEnd w:id="17"/>
       <w:r>
+        <w:lastRenderedPageBreak/>
         <w:t xml:space="preserve">4.3 </w:t>
       </w:r>
       <w:r>
@@ -14226,10 +14040,7 @@
         <w:t>자체를</w:t>
       </w:r>
       <w:r>
-        <w:t xml:space="preserve"> </w:t>
-      </w:r>
-      <w:r>
-        <w:t xml:space="preserve">peer-reviewable, machine-readable artefact </w:t>
+        <w:t xml:space="preserve"> peer-reviewable, machine-readable artefact </w:t>
       </w:r>
       <w:r>
         <w:t>로</w:t>
@@ -14816,7 +14627,10 @@
         <w:t>조절</w:t>
       </w:r>
       <w:r>
-        <w:t xml:space="preserve"> — </w:t>
+        <w:t xml:space="preserve"> </w:t>
+      </w:r>
+      <w:r>
+        <w:t xml:space="preserve">— </w:t>
       </w:r>
       <w:r>
         <w:t>음높이</w:t>
@@ -16378,7 +16192,6 @@
         <w:pStyle w:val="FirstParagraph"/>
       </w:pPr>
       <w:r>
-        <w:lastRenderedPageBreak/>
         <w:t>반복</w:t>
       </w:r>
       <w:r>
@@ -16773,6 +16586,7 @@
         <w:t xml:space="preserve">. MIR </w:t>
       </w:r>
       <w:r>
+        <w:lastRenderedPageBreak/>
         <w:t>문헌의</w:t>
       </w:r>
       <w:r>
@@ -17754,7 +17568,10 @@
         <w:t>공간적</w:t>
       </w:r>
       <w:r>
-        <w:t xml:space="preserve"> (</w:t>
+        <w:t xml:space="preserve"> </w:t>
+      </w:r>
+      <w:r>
+        <w:t>(</w:t>
       </w:r>
       <w:r>
         <w:t>악보</w:t>
@@ -18882,7 +18699,6 @@
         <w:pStyle w:val="a8"/>
       </w:pPr>
       <w:r>
-        <w:lastRenderedPageBreak/>
         <w:t>제시부</w:t>
       </w:r>
       <w:r>
@@ -19226,6 +19042,7 @@
         <w:pStyle w:val="a0"/>
       </w:pPr>
       <w:r>
+        <w:lastRenderedPageBreak/>
         <w:t>위</w:t>
       </w:r>
       <w:r>
@@ -21170,7 +20987,10 @@
         <w:t>확장</w:t>
       </w:r>
       <w:r>
-        <w:t xml:space="preserve"> — Beethoven Op. 49 No. 2, Clementi Op. 36 No. 1 </w:t>
+        <w:t xml:space="preserve"> </w:t>
+      </w:r>
+      <w:r>
+        <w:t xml:space="preserve">— Beethoven Op. 49 No. 2, Clementi Op. 36 No. 1 </w:t>
       </w:r>
       <w:r>
         <w:t>등의</w:t>
@@ -21938,7 +21758,6 @@
       <w:bookmarkStart w:id="32" w:name="재현-가능성-reproducibility"/>
       <w:bookmarkEnd w:id="31"/>
       <w:r>
-        <w:lastRenderedPageBreak/>
         <w:t xml:space="preserve">8. </w:t>
       </w:r>
       <w:r>
@@ -22097,6 +21916,7 @@
               <w:rPr>
                 <w:sz w:val="20"/>
               </w:rPr>
+              <w:lastRenderedPageBreak/>
               <w:t>소스</w:t>
             </w:r>
             <w:r>
@@ -23269,93 +23089,20 @@
         </w:numPr>
       </w:pPr>
       <w:r>
-        <w:t>교육부</w:t>
-      </w:r>
-      <w:r>
-        <w:t xml:space="preserve"> (2022). </w:t>
-      </w:r>
-      <w:r>
-        <w:rPr>
-          <w:i/>
-          <w:iCs/>
-        </w:rPr>
-        <w:t xml:space="preserve">2022 </w:t>
-      </w:r>
-      <w:r>
-        <w:rPr>
-          <w:i/>
-          <w:iCs/>
-        </w:rPr>
-        <w:t>개정</w:t>
-      </w:r>
-      <w:r>
-        <w:rPr>
-          <w:i/>
-          <w:iCs/>
-        </w:rPr>
-        <w:t xml:space="preserve"> </w:t>
-      </w:r>
-      <w:r>
-        <w:rPr>
-          <w:i/>
-          <w:iCs/>
-        </w:rPr>
-        <w:t>교육과정</w:t>
-      </w:r>
-      <w:r>
-        <w:rPr>
-          <w:i/>
-          <w:iCs/>
-        </w:rPr>
-        <w:t xml:space="preserve"> </w:t>
-      </w:r>
-      <w:r>
-        <w:rPr>
-          <w:i/>
-          <w:iCs/>
-        </w:rPr>
-        <w:t>음악과</w:t>
-      </w:r>
-      <w:r>
-        <w:rPr>
-          <w:i/>
-          <w:iCs/>
-        </w:rPr>
-        <w:t xml:space="preserve"> </w:t>
-      </w:r>
-      <w:r>
-        <w:rPr>
-          <w:i/>
-          <w:iCs/>
-        </w:rPr>
-        <w:t>교육과정</w:t>
-      </w:r>
-      <w:r>
-        <w:t xml:space="preserve">. </w:t>
-      </w:r>
-      <w:r>
-        <w:t>교육부</w:t>
-      </w:r>
-      <w:r>
-        <w:t xml:space="preserve"> </w:t>
-      </w:r>
-      <w:r>
-        <w:t>고시</w:t>
-      </w:r>
-      <w:r>
-        <w:t xml:space="preserve"> </w:t>
-      </w:r>
-      <w:r>
-        <w:t>제</w:t>
-      </w:r>
-      <w:r>
-        <w:t>2022-33</w:t>
-      </w:r>
-      <w:r>
-        <w:t>호</w:t>
-      </w:r>
-      <w:r>
-        <w:t>.</w:t>
+        <w:t xml:space="preserve">Brooke, J. (1996). SUS: A “quick and dirty” </w:t>
+      </w:r>
+      <w:r>
+        <w:t xml:space="preserve">usability scale. In </w:t>
+      </w:r>
+      <w:r>
+        <w:rPr>
+          <w:i/>
+          <w:iCs/>
+        </w:rPr>
+        <w:t>Usability Evaluation in Industry</w:t>
+      </w:r>
+      <w:r>
+        <w:t xml:space="preserve"> (pp. 189–194). Taylor &amp; Francis.</w:t>
       </w:r>
     </w:p>
     <w:p>
@@ -23367,53 +23114,508 @@
         </w:numPr>
       </w:pPr>
       <w:r>
-        <w:t>이흥렬</w:t>
-      </w:r>
-      <w:r>
-        <w:t xml:space="preserve">, </w:t>
-      </w:r>
-      <w:r>
-        <w:t>홍정수</w:t>
-      </w:r>
-      <w:r>
-        <w:t xml:space="preserve"> (2017). </w:t>
-      </w:r>
-      <w:r>
-        <w:rPr>
-          <w:i/>
-          <w:iCs/>
-        </w:rPr>
-        <w:t>음악사</w:t>
-      </w:r>
-      <w:r>
-        <w:rPr>
-          <w:i/>
-          <w:iCs/>
-        </w:rPr>
-        <w:t xml:space="preserve"> — </w:t>
-      </w:r>
-      <w:r>
-        <w:rPr>
-          <w:i/>
-          <w:iCs/>
-        </w:rPr>
-        <w:t>서양음악사</w:t>
-      </w:r>
-      <w:r>
-        <w:t xml:space="preserve">. </w:t>
-      </w:r>
-      <w:r>
-        <w:t>음악춘추사</w:t>
-      </w:r>
-      <w:r>
-        <w:t>.</w:t>
+        <w:t xml:space="preserve">Cannam, C., Landone, C., &amp; Sandler, M. (2010). Sonic Visualiser: An open source application for viewing, analysing, and annotating music audio files. In </w:t>
+      </w:r>
+      <w:r>
+        <w:rPr>
+          <w:i/>
+          <w:iCs/>
+        </w:rPr>
+        <w:t>Proceedings of the ACM Multimedia 2010 International Conference</w:t>
+      </w:r>
+      <w:r>
+        <w:t xml:space="preserve"> (pp. 1467–1468).</w:t>
       </w:r>
     </w:p>
     <w:p>
-      <w:r>
-        <w:pict w14:anchorId="688D6160">
-          <v:rect id="_x0000_i1025" style="width:0;height:1.5pt" o:hralign="center" o:hrstd="t" o:hr="t"/>
-        </w:pict>
+      <w:pPr>
+        <w:pStyle w:val="Compact"/>
+        <w:numPr>
+          <w:ilvl w:val="0"/>
+          <w:numId w:val="12"/>
+        </w:numPr>
+      </w:pPr>
+      <w:r>
+        <w:t xml:space="preserve">Caplin, W. E. (1998). </w:t>
+      </w:r>
+      <w:r>
+        <w:rPr>
+          <w:i/>
+          <w:iCs/>
+        </w:rPr>
+        <w:t>Classical Form: A Theory of Formal Functions for the Instrumental Music of Haydn, Mozart, and Beethoven.</w:t>
+      </w:r>
+      <w:r>
+        <w:t xml:space="preserve"> Oxford University Press.</w:t>
+      </w:r>
+    </w:p>
+    <w:p>
+      <w:pPr>
+        <w:pStyle w:val="Compact"/>
+        <w:numPr>
+          <w:ilvl w:val="0"/>
+          <w:numId w:val="12"/>
+        </w:numPr>
+      </w:pPr>
+      <w:r>
+        <w:t xml:space="preserve">Cohen, J. (1988). </w:t>
+      </w:r>
+      <w:r>
+        <w:rPr>
+          <w:i/>
+          <w:iCs/>
+        </w:rPr>
+        <w:t>Statistical Power Analysis for the Behavioral Sciences</w:t>
+      </w:r>
+      <w:r>
+        <w:t xml:space="preserve"> (2nd ed.). Erlbaum.</w:t>
+      </w:r>
+    </w:p>
+    <w:p>
+      <w:pPr>
+        <w:pStyle w:val="Compact"/>
+        <w:numPr>
+          <w:ilvl w:val="0"/>
+          <w:numId w:val="12"/>
+        </w:numPr>
+      </w:pPr>
+      <w:r>
+        <w:t xml:space="preserve">Cook, N. (1990). </w:t>
+      </w:r>
+      <w:r>
+        <w:rPr>
+          <w:i/>
+          <w:iCs/>
+        </w:rPr>
+        <w:t>Music, Imagination, and Culture.</w:t>
+      </w:r>
+      <w:r>
+        <w:t xml:space="preserve"> Oxford University Press.</w:t>
+      </w:r>
+    </w:p>
+    <w:p>
+      <w:pPr>
+        <w:pStyle w:val="Compact"/>
+        <w:numPr>
+          <w:ilvl w:val="0"/>
+          <w:numId w:val="12"/>
+        </w:numPr>
+      </w:pPr>
+      <w:r>
+        <w:t xml:space="preserve">Couprie, P. (2008). iAnalyse: a software dedicated to the graphical analysis of music. In </w:t>
+      </w:r>
+      <w:r>
+        <w:rPr>
+          <w:i/>
+          <w:iCs/>
+        </w:rPr>
+        <w:t>Proceedings of the 5th Sound and Music Computing Conference</w:t>
+      </w:r>
+      <w:r>
+        <w:t>.</w:t>
+      </w:r>
+    </w:p>
+    <w:p>
+      <w:pPr>
+        <w:pStyle w:val="Compact"/>
+        <w:numPr>
+          <w:ilvl w:val="0"/>
+          <w:numId w:val="12"/>
+        </w:numPr>
+      </w:pPr>
+      <w:r>
+        <w:t xml:space="preserve">Goto, M. (2006). AIST Annotation for the RWC Music Database. In </w:t>
+      </w:r>
+      <w:r>
+        <w:rPr>
+          <w:i/>
+          <w:iCs/>
+        </w:rPr>
+        <w:t>Proc. ISMIR</w:t>
+      </w:r>
+      <w:r>
+        <w:t>.</w:t>
+      </w:r>
+    </w:p>
+    <w:p>
+      <w:pPr>
+        <w:pStyle w:val="Compact"/>
+        <w:numPr>
+          <w:ilvl w:val="0"/>
+          <w:numId w:val="12"/>
+        </w:numPr>
+      </w:pPr>
+      <w:r>
+        <w:t xml:space="preserve">Hargreaves, D. J. (1986). </w:t>
+      </w:r>
+      <w:r>
+        <w:rPr>
+          <w:i/>
+          <w:iCs/>
+        </w:rPr>
+        <w:t>The Developmental Psychology of Music.</w:t>
+      </w:r>
+      <w:r>
+        <w:t xml:space="preserve"> Cambridge University Press.</w:t>
+      </w:r>
+    </w:p>
+    <w:p>
+      <w:pPr>
+        <w:pStyle w:val="Compact"/>
+        <w:numPr>
+          <w:ilvl w:val="0"/>
+          <w:numId w:val="12"/>
+        </w:numPr>
+      </w:pPr>
+      <w:r>
+        <w:t xml:space="preserve">Hepokoski, J., &amp; Darcy, W. (2006). </w:t>
+      </w:r>
+      <w:r>
+        <w:rPr>
+          <w:i/>
+          <w:iCs/>
+        </w:rPr>
+        <w:t>Elements of Sonata Theory: Norms, Types, and Deformations in the Late-Eighteenth-Century Sonata.</w:t>
+      </w:r>
+      <w:r>
+        <w:t xml:space="preserve"> Oxford University Press.</w:t>
+      </w:r>
+    </w:p>
+    <w:p>
+      <w:pPr>
+        <w:pStyle w:val="Compact"/>
+        <w:numPr>
+          <w:ilvl w:val="0"/>
+          <w:numId w:val="12"/>
+        </w:numPr>
+      </w:pPr>
+      <w:r>
+        <w:t xml:space="preserve">Kuo, Y.-T., &amp; Chuang, M.-C. (2013). A proposal of a color music notation system on a single melody for music beginners. </w:t>
+      </w:r>
+      <w:r>
+        <w:rPr>
+          <w:i/>
+          <w:iCs/>
+        </w:rPr>
+        <w:t>International Journal of Music Education</w:t>
+      </w:r>
+      <w:r>
+        <w:t>, 31(4), 394–412. https://doi.org/10.1177/0255761413489082</w:t>
+      </w:r>
+    </w:p>
+    <w:p>
+      <w:pPr>
+        <w:pStyle w:val="Compact"/>
+        <w:numPr>
+          <w:ilvl w:val="0"/>
+          <w:numId w:val="12"/>
+        </w:numPr>
+      </w:pPr>
+      <w:r>
+        <w:t xml:space="preserve">LaRue, J. (1970). </w:t>
+      </w:r>
+      <w:r>
+        <w:rPr>
+          <w:i/>
+          <w:iCs/>
+        </w:rPr>
+        <w:t>Guidelines for Style Analysis.</w:t>
+      </w:r>
+      <w:r>
+        <w:t xml:space="preserve"> Norton.</w:t>
+      </w:r>
+    </w:p>
+    <w:p>
+      <w:pPr>
+        <w:pStyle w:val="Compact"/>
+        <w:numPr>
+          <w:ilvl w:val="0"/>
+          <w:numId w:val="12"/>
+        </w:numPr>
+      </w:pPr>
+      <w:r>
+        <w:t xml:space="preserve">Margulis, E. H. (2014). </w:t>
+      </w:r>
+      <w:r>
+        <w:rPr>
+          <w:i/>
+          <w:iCs/>
+        </w:rPr>
+        <w:t>On Repeat: How Music Plays the Mind.</w:t>
+      </w:r>
+      <w:r>
+        <w:t xml:space="preserve"> Oxford University Press.</w:t>
+      </w:r>
+    </w:p>
+    <w:p>
+      <w:pPr>
+        <w:pStyle w:val="Compact"/>
+        <w:numPr>
+          <w:ilvl w:val="0"/>
+          <w:numId w:val="12"/>
+        </w:numPr>
+      </w:pPr>
+      <w:r>
+        <w:t xml:space="preserve">Mayer, R. E. (2009). </w:t>
+      </w:r>
+      <w:r>
+        <w:rPr>
+          <w:i/>
+          <w:iCs/>
+        </w:rPr>
+        <w:t>Multimedia Learning</w:t>
+      </w:r>
+      <w:r>
+        <w:t xml:space="preserve"> (2nd ed.). Cambridge University Press.</w:t>
+      </w:r>
+    </w:p>
+    <w:p>
+      <w:pPr>
+        <w:pStyle w:val="Compact"/>
+        <w:numPr>
+          <w:ilvl w:val="0"/>
+          <w:numId w:val="12"/>
+        </w:numPr>
+      </w:pPr>
+      <w:r>
+        <w:t xml:space="preserve">Mozart, W. A. (1986). </w:t>
+      </w:r>
+      <w:r>
+        <w:rPr>
+          <w:i/>
+          <w:iCs/>
+        </w:rPr>
+        <w:t>Neue Mozart-Ausgabe IX/25: Klaviersonaten Bd. 2.</w:t>
+      </w:r>
+      <w:r>
+        <w:t xml:space="preserve"> Bärenreiter.</w:t>
+      </w:r>
+    </w:p>
+    <w:p>
+      <w:pPr>
+        <w:pStyle w:val="Compact"/>
+        <w:numPr>
+          <w:ilvl w:val="0"/>
+          <w:numId w:val="12"/>
+        </w:numPr>
+      </w:pPr>
+      <w:r>
+        <w:t xml:space="preserve">Nakamura, E., Yoshii, K., &amp; Katayose, H. (2017). Performance Error Detection and Post-Processing for Fast and Accurate Symbolic Music Alignment. In </w:t>
+      </w:r>
+      <w:r>
+        <w:rPr>
+          <w:i/>
+          <w:iCs/>
+        </w:rPr>
+        <w:t>Proc. ISMIR</w:t>
+      </w:r>
+      <w:r>
+        <w:t>.</w:t>
+      </w:r>
+    </w:p>
+    <w:p>
+      <w:pPr>
+        <w:pStyle w:val="Compact"/>
+        <w:numPr>
+          <w:ilvl w:val="0"/>
+          <w:numId w:val="12"/>
+        </w:numPr>
+      </w:pPr>
+      <w:r>
+        <w:t xml:space="preserve">North, A. C., &amp; Hargreaves, D. J. (2008). </w:t>
+      </w:r>
+      <w:r>
+        <w:rPr>
+          <w:i/>
+          <w:iCs/>
+        </w:rPr>
+        <w:t>The Social and Applied Psychology of Music.</w:t>
+      </w:r>
+      <w:r>
+        <w:t xml:space="preserve"> Oxford University Press.</w:t>
+      </w:r>
+    </w:p>
+    <w:p>
+      <w:pPr>
+        <w:pStyle w:val="Compact"/>
+        <w:numPr>
+          <w:ilvl w:val="0"/>
+          <w:numId w:val="12"/>
+        </w:numPr>
+      </w:pPr>
+      <w:r>
+        <w:lastRenderedPageBreak/>
+        <w:t xml:space="preserve">Paivio, A. (1991). Dual Coding Theory: Retrospect and Current Status. </w:t>
+      </w:r>
+      <w:r>
+        <w:rPr>
+          <w:i/>
+          <w:iCs/>
+        </w:rPr>
+        <w:t>Canadian Journal of Psychology</w:t>
+      </w:r>
+      <w:r>
+        <w:t>, 45(3), 255–287.</w:t>
+      </w:r>
+    </w:p>
+    <w:p>
+      <w:pPr>
+        <w:pStyle w:val="Compact"/>
+        <w:numPr>
+          <w:ilvl w:val="0"/>
+          <w:numId w:val="12"/>
+        </w:numPr>
+      </w:pPr>
+      <w:r>
+        <w:t xml:space="preserve">Sapp, C. S. (2011). </w:t>
+      </w:r>
+      <w:r>
+        <w:rPr>
+          <w:i/>
+          <w:iCs/>
+        </w:rPr>
+        <w:t>Computational Methods for the Analysis of Musical Structure.</w:t>
+      </w:r>
+      <w:r>
+        <w:t xml:space="preserve"> PhD thesis, Stanford CCRMA.</w:t>
+      </w:r>
+    </w:p>
+    <w:p>
+      <w:pPr>
+        <w:pStyle w:val="Compact"/>
+        <w:numPr>
+          <w:ilvl w:val="0"/>
+          <w:numId w:val="12"/>
+        </w:numPr>
+      </w:pPr>
+      <w:r>
+        <w:t xml:space="preserve">Sapp, C. S. (2017). Verovio Humdrum Viewer. In </w:t>
+      </w:r>
+      <w:r>
+        <w:rPr>
+          <w:i/>
+          <w:iCs/>
+        </w:rPr>
+        <w:t>Music Encoding Conference</w:t>
+      </w:r>
+      <w:r>
+        <w:t>.</w:t>
+      </w:r>
+    </w:p>
+    <w:p>
+      <w:pPr>
+        <w:pStyle w:val="Compact"/>
+        <w:numPr>
+          <w:ilvl w:val="0"/>
+          <w:numId w:val="12"/>
+        </w:numPr>
+      </w:pPr>
+      <w:r>
+        <w:t xml:space="preserve">Sauro, J., &amp; Lewis, J. R. (2016). </w:t>
+      </w:r>
+      <w:r>
+        <w:rPr>
+          <w:i/>
+          <w:iCs/>
+        </w:rPr>
+        <w:t>Quantifying the User Experience: Practical Statistics for User Research</w:t>
+      </w:r>
+      <w:r>
+        <w:t xml:space="preserve"> (2nd ed.). Morgan Kaufmann.</w:t>
+      </w:r>
+    </w:p>
+    <w:p>
+      <w:pPr>
+        <w:pStyle w:val="Compact"/>
+        <w:numPr>
+          <w:ilvl w:val="0"/>
+          <w:numId w:val="12"/>
+        </w:numPr>
+      </w:pPr>
+      <w:r>
+        <w:t xml:space="preserve">Shadish, W. R., Cook, T. D., &amp; Campbell, D. T. (2002). </w:t>
+      </w:r>
+      <w:r>
+        <w:rPr>
+          <w:i/>
+          <w:iCs/>
+        </w:rPr>
+        <w:t>Experimental and Quasi-Experimental Designs for Generalized Causal Inference.</w:t>
+      </w:r>
+      <w:r>
+        <w:t xml:space="preserve"> Houghton Mifflin.</w:t>
+      </w:r>
+    </w:p>
+    <w:p>
+      <w:pPr>
+        <w:pStyle w:val="1"/>
+      </w:pPr>
+      <w:bookmarkStart w:id="34" w:name="부록-a.-시스템-화면"/>
+      <w:bookmarkEnd w:id="33"/>
+      <w:r>
+        <w:t>부록</w:t>
+      </w:r>
+      <w:r>
+        <w:t xml:space="preserve"> A. </w:t>
+      </w:r>
+      <w:r>
+        <w:t>시스템</w:t>
+      </w:r>
+      <w:r>
+        <w:t xml:space="preserve"> </w:t>
+      </w:r>
+      <w:r>
+        <w:t>화면</w:t>
+      </w:r>
+    </w:p>
+    <w:p>
+      <w:pPr>
+        <w:pStyle w:val="FirstParagraph"/>
+      </w:pPr>
+      <w:r>
+        <w:t xml:space="preserve">(figures/ </w:t>
+      </w:r>
+      <w:r>
+        <w:t>폴더의</w:t>
+      </w:r>
+      <w:r>
+        <w:t xml:space="preserve"> PNG </w:t>
+      </w:r>
+      <w:r>
+        <w:t>파일</w:t>
+      </w:r>
+      <w:r>
+        <w:t xml:space="preserve"> — </w:t>
+      </w:r>
+      <w:r>
+        <w:t>본</w:t>
+      </w:r>
+      <w:r>
+        <w:t xml:space="preserve"> </w:t>
+      </w:r>
+      <w:r>
+        <w:t>도구의</w:t>
+      </w:r>
+      <w:r>
+        <w:t xml:space="preserve"> </w:t>
+      </w:r>
+      <w:r>
+        <w:t>스크린샷</w:t>
+      </w:r>
+      <w:r>
+        <w:t xml:space="preserve"> 3</w:t>
+      </w:r>
+      <w:r>
+        <w:t>종을</w:t>
+      </w:r>
+      <w:r>
+        <w:t xml:space="preserve"> </w:t>
+      </w:r>
+      <w:r>
+        <w:t>첨부</w:t>
+      </w:r>
+      <w:r>
+        <w:t>)</w:t>
       </w:r>
     </w:p>
     <w:p>
@@ -23425,20 +23627,28 @@
         </w:numPr>
       </w:pPr>
       <w:r>
-        <w:t xml:space="preserve">Brooke, J. (1996). SUS: A “quick and dirty” </w:t>
-      </w:r>
-      <w:r>
-        <w:t xml:space="preserve">usability scale. In </w:t>
-      </w:r>
-      <w:r>
-        <w:rPr>
-          <w:i/>
-          <w:iCs/>
-        </w:rPr>
-        <w:t>Usability Evaluation in Industry</w:t>
-      </w:r>
-      <w:r>
-        <w:t xml:space="preserve"> (pp. 189–194). Taylor &amp; Francis.</w:t>
+        <w:t xml:space="preserve">Figure A.1 — </w:t>
+      </w:r>
+      <w:r>
+        <w:t>시스템</w:t>
+      </w:r>
+      <w:r>
+        <w:t xml:space="preserve"> </w:t>
+      </w:r>
+      <w:r>
+        <w:t>전체</w:t>
+      </w:r>
+      <w:r>
+        <w:t xml:space="preserve"> </w:t>
+      </w:r>
+      <w:r>
+        <w:t>화면</w:t>
+      </w:r>
+      <w:r>
+        <w:t xml:space="preserve"> </w:t>
+      </w:r>
+      <w:r>
+        <w:t>개관</w:t>
       </w:r>
     </w:p>
     <w:p>
@@ -23450,17 +23660,37 @@
         </w:numPr>
       </w:pPr>
       <w:r>
-        <w:t xml:space="preserve">Cannam, C., Landone, C., &amp; Sandler, M. (2010). Sonic Visualiser: An open source application for viewing, analysing, and annotating music audio files. In </w:t>
-      </w:r>
-      <w:r>
-        <w:rPr>
-          <w:i/>
-          <w:iCs/>
-        </w:rPr>
-        <w:t>Proceedings of the ACM Multimedia 2010 International Conference</w:t>
-      </w:r>
-      <w:r>
-        <w:t xml:space="preserve"> (pp. 1467–1468).</w:t>
+        <w:t xml:space="preserve">Figure A.2 — </w:t>
+      </w:r>
+      <w:r>
+        <w:t>형식</w:t>
+      </w:r>
+      <w:r>
+        <w:t xml:space="preserve"> </w:t>
+      </w:r>
+      <w:r>
+        <w:t>타임라인</w:t>
+      </w:r>
+      <w:r>
+        <w:t xml:space="preserve"> </w:t>
+      </w:r>
+      <w:r>
+        <w:t>클로즈업</w:t>
+      </w:r>
+      <w:r>
+        <w:t xml:space="preserve"> (P/S/codetta </w:t>
+      </w:r>
+      <w:r>
+        <w:t>색상</w:t>
+      </w:r>
+      <w:r>
+        <w:t xml:space="preserve"> </w:t>
+      </w:r>
+      <w:r>
+        <w:t>인코딩</w:t>
+      </w:r>
+      <w:r>
+        <w:t>)</w:t>
       </w:r>
     </w:p>
     <w:p>
@@ -23469,572 +23699,6 @@
         <w:numPr>
           <w:ilvl w:val="0"/>
           <w:numId w:val="13"/>
-        </w:numPr>
-      </w:pPr>
-      <w:r>
-        <w:t xml:space="preserve">Caplin, W. E. (1998). </w:t>
-      </w:r>
-      <w:r>
-        <w:rPr>
-          <w:i/>
-          <w:iCs/>
-        </w:rPr>
-        <w:t>Classical Form: A Theory of Formal Functions for the Instrumental Music of Haydn, Mozart, and Beethoven.</w:t>
-      </w:r>
-      <w:r>
-        <w:t xml:space="preserve"> Oxford University Press.</w:t>
-      </w:r>
-    </w:p>
-    <w:p>
-      <w:pPr>
-        <w:pStyle w:val="Compact"/>
-        <w:numPr>
-          <w:ilvl w:val="0"/>
-          <w:numId w:val="13"/>
-        </w:numPr>
-      </w:pPr>
-      <w:r>
-        <w:t xml:space="preserve">Cohen, J. (1988). </w:t>
-      </w:r>
-      <w:r>
-        <w:rPr>
-          <w:i/>
-          <w:iCs/>
-        </w:rPr>
-        <w:t>Statistical Power Analysis for the Behavioral Sciences</w:t>
-      </w:r>
-      <w:r>
-        <w:t xml:space="preserve"> (2nd ed.). Erlbaum.</w:t>
-      </w:r>
-    </w:p>
-    <w:p>
-      <w:pPr>
-        <w:pStyle w:val="Compact"/>
-        <w:numPr>
-          <w:ilvl w:val="0"/>
-          <w:numId w:val="13"/>
-        </w:numPr>
-      </w:pPr>
-      <w:r>
-        <w:t xml:space="preserve">Cook, N. (1990). </w:t>
-      </w:r>
-      <w:r>
-        <w:rPr>
-          <w:i/>
-          <w:iCs/>
-        </w:rPr>
-        <w:t>Music, Imagination, and Culture.</w:t>
-      </w:r>
-      <w:r>
-        <w:t xml:space="preserve"> Oxford University Press.</w:t>
-      </w:r>
-    </w:p>
-    <w:p>
-      <w:pPr>
-        <w:pStyle w:val="Compact"/>
-        <w:numPr>
-          <w:ilvl w:val="0"/>
-          <w:numId w:val="13"/>
-        </w:numPr>
-      </w:pPr>
-      <w:r>
-        <w:t xml:space="preserve">Couprie, P. (2008). iAnalyse: a software dedicated to the graphical analysis of music. In </w:t>
-      </w:r>
-      <w:r>
-        <w:rPr>
-          <w:i/>
-          <w:iCs/>
-        </w:rPr>
-        <w:t>Proceedings of the 5th Sound and Music Computing Conference</w:t>
-      </w:r>
-      <w:r>
-        <w:t>.</w:t>
-      </w:r>
-    </w:p>
-    <w:p>
-      <w:pPr>
-        <w:pStyle w:val="Compact"/>
-        <w:numPr>
-          <w:ilvl w:val="0"/>
-          <w:numId w:val="13"/>
-        </w:numPr>
-      </w:pPr>
-      <w:r>
-        <w:t xml:space="preserve">Goto, M. (2006). AIST Annotation for the RWC Music Database. In </w:t>
-      </w:r>
-      <w:r>
-        <w:rPr>
-          <w:i/>
-          <w:iCs/>
-        </w:rPr>
-        <w:t>Proc. ISMIR</w:t>
-      </w:r>
-      <w:r>
-        <w:t>.</w:t>
-      </w:r>
-    </w:p>
-    <w:p>
-      <w:pPr>
-        <w:pStyle w:val="Compact"/>
-        <w:numPr>
-          <w:ilvl w:val="0"/>
-          <w:numId w:val="13"/>
-        </w:numPr>
-      </w:pPr>
-      <w:r>
-        <w:t xml:space="preserve">Hargreaves, D. J. (1986). </w:t>
-      </w:r>
-      <w:r>
-        <w:rPr>
-          <w:i/>
-          <w:iCs/>
-        </w:rPr>
-        <w:t>The Developmental Psychology of Music.</w:t>
-      </w:r>
-      <w:r>
-        <w:t xml:space="preserve"> Cambridge University Press.</w:t>
-      </w:r>
-    </w:p>
-    <w:p>
-      <w:pPr>
-        <w:pStyle w:val="Compact"/>
-        <w:numPr>
-          <w:ilvl w:val="0"/>
-          <w:numId w:val="13"/>
-        </w:numPr>
-      </w:pPr>
-      <w:r>
-        <w:t xml:space="preserve">Hepokoski, J., &amp; Darcy, W. (2006). </w:t>
-      </w:r>
-      <w:r>
-        <w:rPr>
-          <w:i/>
-          <w:iCs/>
-        </w:rPr>
-        <w:t>Elements of Sonata Theory: Norms, Types, and Deformations in the Late-Eighteenth-Century Sonata.</w:t>
-      </w:r>
-      <w:r>
-        <w:t xml:space="preserve"> Oxford University Press.</w:t>
-      </w:r>
-    </w:p>
-    <w:p>
-      <w:pPr>
-        <w:pStyle w:val="Compact"/>
-        <w:numPr>
-          <w:ilvl w:val="0"/>
-          <w:numId w:val="13"/>
-        </w:numPr>
-      </w:pPr>
-      <w:r>
-        <w:t xml:space="preserve">Kuo, Y.-T., &amp; Chuang, M.-C. (2013). A proposal of a color music notation system on a single melody for music beginners. </w:t>
-      </w:r>
-      <w:r>
-        <w:rPr>
-          <w:i/>
-          <w:iCs/>
-        </w:rPr>
-        <w:t>International Journal of Music Education</w:t>
-      </w:r>
-      <w:r>
-        <w:t>, 31(4), 394–412. https://doi.org/10.1177/0255761413489082</w:t>
-      </w:r>
-    </w:p>
-    <w:p>
-      <w:pPr>
-        <w:pStyle w:val="Compact"/>
-        <w:numPr>
-          <w:ilvl w:val="0"/>
-          <w:numId w:val="13"/>
-        </w:numPr>
-      </w:pPr>
-      <w:r>
-        <w:t xml:space="preserve">LaRue, J. (1970). </w:t>
-      </w:r>
-      <w:r>
-        <w:rPr>
-          <w:i/>
-          <w:iCs/>
-        </w:rPr>
-        <w:t>Guidelines for Style Analysis.</w:t>
-      </w:r>
-      <w:r>
-        <w:t xml:space="preserve"> Norton.</w:t>
-      </w:r>
-    </w:p>
-    <w:p>
-      <w:pPr>
-        <w:pStyle w:val="Compact"/>
-        <w:numPr>
-          <w:ilvl w:val="0"/>
-          <w:numId w:val="13"/>
-        </w:numPr>
-      </w:pPr>
-      <w:r>
-        <w:t xml:space="preserve">Margulis, E. H. (2014). </w:t>
-      </w:r>
-      <w:r>
-        <w:rPr>
-          <w:i/>
-          <w:iCs/>
-        </w:rPr>
-        <w:t>On Repeat: How Music Plays the Mind.</w:t>
-      </w:r>
-      <w:r>
-        <w:t xml:space="preserve"> Oxford University Press.</w:t>
-      </w:r>
-    </w:p>
-    <w:p>
-      <w:pPr>
-        <w:pStyle w:val="Compact"/>
-        <w:numPr>
-          <w:ilvl w:val="0"/>
-          <w:numId w:val="13"/>
-        </w:numPr>
-      </w:pPr>
-      <w:r>
-        <w:lastRenderedPageBreak/>
-        <w:t xml:space="preserve">Mayer, R. E. (2009). </w:t>
-      </w:r>
-      <w:r>
-        <w:rPr>
-          <w:i/>
-          <w:iCs/>
-        </w:rPr>
-        <w:t>Multimedia Learning</w:t>
-      </w:r>
-      <w:r>
-        <w:t xml:space="preserve"> (2nd ed.). Cambridge University Press.</w:t>
-      </w:r>
-    </w:p>
-    <w:p>
-      <w:pPr>
-        <w:pStyle w:val="Compact"/>
-        <w:numPr>
-          <w:ilvl w:val="0"/>
-          <w:numId w:val="13"/>
-        </w:numPr>
-      </w:pPr>
-      <w:r>
-        <w:t xml:space="preserve">Mozart, W. A. (1986). </w:t>
-      </w:r>
-      <w:r>
-        <w:rPr>
-          <w:i/>
-          <w:iCs/>
-        </w:rPr>
-        <w:t>Neue Mozart-Ausgabe IX/25: Klaviersonaten Bd. 2.</w:t>
-      </w:r>
-      <w:r>
-        <w:t xml:space="preserve"> Bärenreiter.</w:t>
-      </w:r>
-    </w:p>
-    <w:p>
-      <w:pPr>
-        <w:pStyle w:val="Compact"/>
-        <w:numPr>
-          <w:ilvl w:val="0"/>
-          <w:numId w:val="13"/>
-        </w:numPr>
-      </w:pPr>
-      <w:r>
-        <w:t xml:space="preserve">Nakamura, E., Yoshii, K., &amp; Katayose, H. (2017). Performance Error Detection and Post-Processing for Fast and Accurate Symbolic Music Alignment. In </w:t>
-      </w:r>
-      <w:r>
-        <w:rPr>
-          <w:i/>
-          <w:iCs/>
-        </w:rPr>
-        <w:t>Proc. ISMIR</w:t>
-      </w:r>
-      <w:r>
-        <w:t>.</w:t>
-      </w:r>
-    </w:p>
-    <w:p>
-      <w:pPr>
-        <w:pStyle w:val="Compact"/>
-        <w:numPr>
-          <w:ilvl w:val="0"/>
-          <w:numId w:val="13"/>
-        </w:numPr>
-      </w:pPr>
-      <w:r>
-        <w:t xml:space="preserve">North, A. C., &amp; Hargreaves, D. J. (2008). </w:t>
-      </w:r>
-      <w:r>
-        <w:rPr>
-          <w:i/>
-          <w:iCs/>
-        </w:rPr>
-        <w:t>The Social and Applied Psychology of Music.</w:t>
-      </w:r>
-      <w:r>
-        <w:t xml:space="preserve"> Oxford University Press.</w:t>
-      </w:r>
-    </w:p>
-    <w:p>
-      <w:pPr>
-        <w:pStyle w:val="Compact"/>
-        <w:numPr>
-          <w:ilvl w:val="0"/>
-          <w:numId w:val="13"/>
-        </w:numPr>
-      </w:pPr>
-      <w:r>
-        <w:t xml:space="preserve">Paivio, A. (1991). Dual Coding Theory: Retrospect and Current Status. </w:t>
-      </w:r>
-      <w:r>
-        <w:rPr>
-          <w:i/>
-          <w:iCs/>
-        </w:rPr>
-        <w:t>Canadian Journal of Psychology</w:t>
-      </w:r>
-      <w:r>
-        <w:t>, 45(3), 255–287.</w:t>
-      </w:r>
-    </w:p>
-    <w:p>
-      <w:pPr>
-        <w:pStyle w:val="Compact"/>
-        <w:numPr>
-          <w:ilvl w:val="0"/>
-          <w:numId w:val="13"/>
-        </w:numPr>
-      </w:pPr>
-      <w:r>
-        <w:t xml:space="preserve">Sapp, C. S. (2011). </w:t>
-      </w:r>
-      <w:r>
-        <w:rPr>
-          <w:i/>
-          <w:iCs/>
-        </w:rPr>
-        <w:t>Computational Methods for the Analysis of Musical Structure.</w:t>
-      </w:r>
-      <w:r>
-        <w:t xml:space="preserve"> PhD thesis, Stanford CCRMA.</w:t>
-      </w:r>
-    </w:p>
-    <w:p>
-      <w:pPr>
-        <w:pStyle w:val="Compact"/>
-        <w:numPr>
-          <w:ilvl w:val="0"/>
-          <w:numId w:val="13"/>
-        </w:numPr>
-      </w:pPr>
-      <w:r>
-        <w:t xml:space="preserve">Sapp, C. S. (2017). Verovio Humdrum Viewer. In </w:t>
-      </w:r>
-      <w:r>
-        <w:rPr>
-          <w:i/>
-          <w:iCs/>
-        </w:rPr>
-        <w:t>Music Encoding Conference</w:t>
-      </w:r>
-      <w:r>
-        <w:t>.</w:t>
-      </w:r>
-    </w:p>
-    <w:p>
-      <w:pPr>
-        <w:pStyle w:val="Compact"/>
-        <w:numPr>
-          <w:ilvl w:val="0"/>
-          <w:numId w:val="13"/>
-        </w:numPr>
-      </w:pPr>
-      <w:r>
-        <w:t xml:space="preserve">Sauro, J., &amp; Lewis, J. R. (2016). </w:t>
-      </w:r>
-      <w:r>
-        <w:rPr>
-          <w:i/>
-          <w:iCs/>
-        </w:rPr>
-        <w:t>Quantifying the User Experience: Practical Statistics for User Research</w:t>
-      </w:r>
-      <w:r>
-        <w:t xml:space="preserve"> (2nd ed.). Morgan Kaufmann.</w:t>
-      </w:r>
-    </w:p>
-    <w:p>
-      <w:pPr>
-        <w:pStyle w:val="Compact"/>
-        <w:numPr>
-          <w:ilvl w:val="0"/>
-          <w:numId w:val="13"/>
-        </w:numPr>
-      </w:pPr>
-      <w:r>
-        <w:t xml:space="preserve">Shadish, W. R., Cook, T. D., &amp; Campbell, D. T. (2002). </w:t>
-      </w:r>
-      <w:r>
-        <w:rPr>
-          <w:i/>
-          <w:iCs/>
-        </w:rPr>
-        <w:t>Experimental and Quasi-Experimental Designs for Generalized Causal Inference.</w:t>
-      </w:r>
-      <w:r>
-        <w:t xml:space="preserve"> Houghton Mifflin.</w:t>
-      </w:r>
-    </w:p>
-    <w:p>
-      <w:pPr>
-        <w:pStyle w:val="1"/>
-      </w:pPr>
-      <w:bookmarkStart w:id="34" w:name="부록-a.-시스템-화면"/>
-      <w:bookmarkEnd w:id="33"/>
-      <w:r>
-        <w:t>부록</w:t>
-      </w:r>
-      <w:r>
-        <w:t xml:space="preserve"> A. </w:t>
-      </w:r>
-      <w:r>
-        <w:t>시스템</w:t>
-      </w:r>
-      <w:r>
-        <w:t xml:space="preserve"> </w:t>
-      </w:r>
-      <w:r>
-        <w:t>화면</w:t>
-      </w:r>
-    </w:p>
-    <w:p>
-      <w:pPr>
-        <w:pStyle w:val="FirstParagraph"/>
-      </w:pPr>
-      <w:r>
-        <w:t xml:space="preserve">(figures/ </w:t>
-      </w:r>
-      <w:r>
-        <w:t>폴더의</w:t>
-      </w:r>
-      <w:r>
-        <w:t xml:space="preserve"> PNG </w:t>
-      </w:r>
-      <w:r>
-        <w:t>파일</w:t>
-      </w:r>
-      <w:r>
-        <w:t xml:space="preserve"> — </w:t>
-      </w:r>
-      <w:r>
-        <w:t>본</w:t>
-      </w:r>
-      <w:r>
-        <w:t xml:space="preserve"> </w:t>
-      </w:r>
-      <w:r>
-        <w:t>도구의</w:t>
-      </w:r>
-      <w:r>
-        <w:t xml:space="preserve"> </w:t>
-      </w:r>
-      <w:r>
-        <w:t>스크린샷</w:t>
-      </w:r>
-      <w:r>
-        <w:t xml:space="preserve"> 3</w:t>
-      </w:r>
-      <w:r>
-        <w:t>종을</w:t>
-      </w:r>
-      <w:r>
-        <w:t xml:space="preserve"> </w:t>
-      </w:r>
-      <w:r>
-        <w:t>첨부</w:t>
-      </w:r>
-      <w:r>
-        <w:t>)</w:t>
-      </w:r>
-    </w:p>
-    <w:p>
-      <w:pPr>
-        <w:pStyle w:val="Compact"/>
-        <w:numPr>
-          <w:ilvl w:val="0"/>
-          <w:numId w:val="14"/>
-        </w:numPr>
-      </w:pPr>
-      <w:r>
-        <w:t xml:space="preserve">Figure A.1 — </w:t>
-      </w:r>
-      <w:r>
-        <w:t>시스템</w:t>
-      </w:r>
-      <w:r>
-        <w:t xml:space="preserve"> </w:t>
-      </w:r>
-      <w:r>
-        <w:t>전체</w:t>
-      </w:r>
-      <w:r>
-        <w:t xml:space="preserve"> </w:t>
-      </w:r>
-      <w:r>
-        <w:t>화면</w:t>
-      </w:r>
-      <w:r>
-        <w:t xml:space="preserve"> </w:t>
-      </w:r>
-      <w:r>
-        <w:t>개관</w:t>
-      </w:r>
-    </w:p>
-    <w:p>
-      <w:pPr>
-        <w:pStyle w:val="Compact"/>
-        <w:numPr>
-          <w:ilvl w:val="0"/>
-          <w:numId w:val="14"/>
-        </w:numPr>
-      </w:pPr>
-      <w:r>
-        <w:t xml:space="preserve">Figure A.2 — </w:t>
-      </w:r>
-      <w:r>
-        <w:t>형식</w:t>
-      </w:r>
-      <w:r>
-        <w:t xml:space="preserve"> </w:t>
-      </w:r>
-      <w:r>
-        <w:t>타임라인</w:t>
-      </w:r>
-      <w:r>
-        <w:t xml:space="preserve"> </w:t>
-      </w:r>
-      <w:r>
-        <w:t>클로즈업</w:t>
-      </w:r>
-      <w:r>
-        <w:t xml:space="preserve"> (P/S/codetta </w:t>
-      </w:r>
-      <w:r>
-        <w:t>색상</w:t>
-      </w:r>
-      <w:r>
-        <w:t xml:space="preserve"> </w:t>
-      </w:r>
-      <w:r>
-        <w:t>인코딩</w:t>
-      </w:r>
-      <w:r>
-        <w:t>)</w:t>
-      </w:r>
-    </w:p>
-    <w:p>
-      <w:pPr>
-        <w:pStyle w:val="Compact"/>
-        <w:numPr>
-          <w:ilvl w:val="0"/>
-          <w:numId w:val="14"/>
         </w:numPr>
       </w:pPr>
       <w:r>
@@ -24300,7 +23964,7 @@
   <w:abstractNum w:abstractNumId="0" w15:restartNumberingAfterBreak="0">
     <w:nsid w:val="0000A990"/>
     <w:multiLevelType w:val="multilevel"/>
-    <w:tmpl w:val="05E2230A"/>
+    <w:tmpl w:val="FFE8FC84"/>
     <w:lvl w:ilvl="0">
       <w:numFmt w:val="bullet"/>
       <w:lvlText w:val=" "/>
@@ -24377,7 +24041,7 @@
   <w:abstractNum w:abstractNumId="1" w15:restartNumberingAfterBreak="0">
     <w:nsid w:val="0000A991"/>
     <w:multiLevelType w:val="multilevel"/>
-    <w:tmpl w:val="06CAF004"/>
+    <w:tmpl w:val="85521D72"/>
     <w:lvl w:ilvl="0">
       <w:numFmt w:val="bullet"/>
       <w:lvlText w:val=""/>
@@ -24481,7 +24145,7 @@
   <w:abstractNum w:abstractNumId="2" w15:restartNumberingAfterBreak="0">
     <w:nsid w:val="00A99411"/>
     <w:multiLevelType w:val="multilevel"/>
-    <w:tmpl w:val="C9D81484"/>
+    <w:tmpl w:val="0C9AE37E"/>
     <w:lvl w:ilvl="0">
       <w:start w:val="1"/>
       <w:numFmt w:val="decimal"/>
@@ -24564,16 +24228,16 @@
       </w:pPr>
     </w:lvl>
   </w:abstractNum>
-  <w:num w:numId="1" w16cid:durableId="81268689">
+  <w:num w:numId="1" w16cid:durableId="1113475366">
     <w:abstractNumId w:val="0"/>
   </w:num>
-  <w:num w:numId="2" w16cid:durableId="24840454">
+  <w:num w:numId="2" w16cid:durableId="135220185">
     <w:abstractNumId w:val="1"/>
   </w:num>
-  <w:num w:numId="3" w16cid:durableId="740299881">
+  <w:num w:numId="3" w16cid:durableId="123890438">
     <w:abstractNumId w:val="1"/>
   </w:num>
-  <w:num w:numId="4" w16cid:durableId="295066678">
+  <w:num w:numId="4" w16cid:durableId="577330529">
     <w:abstractNumId w:val="2"/>
     <w:lvlOverride w:ilvl="0">
       <w:startOverride w:val="1"/>
@@ -24603,7 +24267,7 @@
       <w:startOverride w:val="1"/>
     </w:lvlOverride>
   </w:num>
-  <w:num w:numId="5" w16cid:durableId="1474174000">
+  <w:num w:numId="5" w16cid:durableId="1319305794">
     <w:abstractNumId w:val="2"/>
     <w:lvlOverride w:ilvl="0">
       <w:startOverride w:val="1"/>
@@ -24633,10 +24297,10 @@
       <w:startOverride w:val="1"/>
     </w:lvlOverride>
   </w:num>
-  <w:num w:numId="6" w16cid:durableId="2091005300">
+  <w:num w:numId="6" w16cid:durableId="823084577">
     <w:abstractNumId w:val="1"/>
   </w:num>
-  <w:num w:numId="7" w16cid:durableId="1120302555">
+  <w:num w:numId="7" w16cid:durableId="1745377972">
     <w:abstractNumId w:val="2"/>
     <w:lvlOverride w:ilvl="0">
       <w:startOverride w:val="1"/>
@@ -24666,10 +24330,10 @@
       <w:startOverride w:val="1"/>
     </w:lvlOverride>
   </w:num>
-  <w:num w:numId="8" w16cid:durableId="712583581">
+  <w:num w:numId="8" w16cid:durableId="1406411193">
     <w:abstractNumId w:val="1"/>
   </w:num>
-  <w:num w:numId="9" w16cid:durableId="989333071">
+  <w:num w:numId="9" w16cid:durableId="344597230">
     <w:abstractNumId w:val="2"/>
     <w:lvlOverride w:ilvl="0">
       <w:startOverride w:val="1"/>
@@ -24699,10 +24363,10 @@
       <w:startOverride w:val="1"/>
     </w:lvlOverride>
   </w:num>
-  <w:num w:numId="10" w16cid:durableId="2034334651">
+  <w:num w:numId="10" w16cid:durableId="843201154">
     <w:abstractNumId w:val="1"/>
   </w:num>
-  <w:num w:numId="11" w16cid:durableId="595014294">
+  <w:num w:numId="11" w16cid:durableId="1121537707">
     <w:abstractNumId w:val="2"/>
     <w:lvlOverride w:ilvl="0">
       <w:startOverride w:val="1"/>
@@ -24732,13 +24396,10 @@
       <w:startOverride w:val="1"/>
     </w:lvlOverride>
   </w:num>
-  <w:num w:numId="12" w16cid:durableId="1699550973">
+  <w:num w:numId="12" w16cid:durableId="1753427911">
     <w:abstractNumId w:val="1"/>
   </w:num>
-  <w:num w:numId="13" w16cid:durableId="1015422652">
-    <w:abstractNumId w:val="1"/>
-  </w:num>
-  <w:num w:numId="14" w16cid:durableId="670839098">
+  <w:num w:numId="13" w16cid:durableId="1023286981">
     <w:abstractNumId w:val="1"/>
   </w:num>
 </w:numbering>
@@ -25980,7 +25641,7 @@
     <w:name w:val="header"/>
     <w:basedOn w:val="a"/>
     <w:link w:val="Char2"/>
-    <w:rsid w:val="002354AC"/>
+    <w:rsid w:val="008F23B0"/>
     <w:pPr>
       <w:tabs>
         <w:tab w:val="center" w:pos="4513"/>
@@ -25993,13 +25654,13 @@
     <w:name w:val="머리글 Char"/>
     <w:basedOn w:val="a1"/>
     <w:link w:val="ad"/>
-    <w:rsid w:val="002354AC"/>
+    <w:rsid w:val="008F23B0"/>
   </w:style>
   <w:style w:type="paragraph" w:styleId="ae">
     <w:name w:val="footer"/>
     <w:basedOn w:val="a"/>
     <w:link w:val="Char3"/>
-    <w:rsid w:val="002354AC"/>
+    <w:rsid w:val="008F23B0"/>
     <w:pPr>
       <w:tabs>
         <w:tab w:val="center" w:pos="4513"/>
@@ -26012,12 +25673,12 @@
     <w:name w:val="바닥글 Char"/>
     <w:basedOn w:val="a1"/>
     <w:link w:val="ae"/>
-    <w:rsid w:val="002354AC"/>
+    <w:rsid w:val="008F23B0"/>
   </w:style>
   <w:style w:type="character" w:styleId="af">
     <w:name w:val="page number"/>
     <w:basedOn w:val="a1"/>
-    <w:rsid w:val="002354AC"/>
+    <w:rsid w:val="008F23B0"/>
   </w:style>
 </w:styles>
 </file>

</xml_diff>